<commit_message>
docs: refresh course deliverables and submission package
</commit_message>
<xml_diff>
--- a/deliverables/01-项目开发计划.docx
+++ b/deliverables/01-项目开发计划.docx
@@ -358,7 +358,7 @@
                 <w:b w:val="0"/>
                 <w:sz w:val="21"/>
               </w:rPr>
-              <w:t>2026-10-29</w:t>
+              <w:t>2026-10-31</w:t>
             </w:r>
           </w:p>
         </w:tc>
@@ -418,7 +418,7 @@
         <w:fldChar w:fldCharType="begin"/>
       </w:r>
       <w:r>
-        <w:instrText xml:space="preserve"> HYPERLINK \l _Toc14649 </w:instrText>
+        <w:instrText xml:space="preserve"> HYPERLINK \l _Toc3456 </w:instrText>
       </w:r>
       <w:r>
         <w:fldChar w:fldCharType="separate"/>
@@ -436,7 +436,7 @@
         <w:fldChar w:fldCharType="begin"/>
       </w:r>
       <w:r>
-        <w:instrText xml:space="preserve"> PAGEREF _Toc14649 \h </w:instrText>
+        <w:instrText xml:space="preserve"> PAGEREF _Toc3456 \h </w:instrText>
       </w:r>
       <w:r>
         <w:fldChar w:fldCharType="separate"/>
@@ -462,7 +462,7 @@
         <w:fldChar w:fldCharType="begin"/>
       </w:r>
       <w:r>
-        <w:instrText xml:space="preserve"> HYPERLINK \l _Toc3721 </w:instrText>
+        <w:instrText xml:space="preserve"> HYPERLINK \l _Toc11491 </w:instrText>
       </w:r>
       <w:r>
         <w:fldChar w:fldCharType="separate"/>
@@ -480,7 +480,7 @@
         <w:fldChar w:fldCharType="begin"/>
       </w:r>
       <w:r>
-        <w:instrText xml:space="preserve"> PAGEREF _Toc3721 \h </w:instrText>
+        <w:instrText xml:space="preserve"> PAGEREF _Toc11491 \h </w:instrText>
       </w:r>
       <w:r>
         <w:fldChar w:fldCharType="separate"/>
@@ -506,7 +506,7 @@
         <w:fldChar w:fldCharType="begin"/>
       </w:r>
       <w:r>
-        <w:instrText xml:space="preserve"> HYPERLINK \l _Toc31312 </w:instrText>
+        <w:instrText xml:space="preserve"> HYPERLINK \l _Toc5520 </w:instrText>
       </w:r>
       <w:r>
         <w:fldChar w:fldCharType="separate"/>
@@ -524,7 +524,7 @@
         <w:fldChar w:fldCharType="begin"/>
       </w:r>
       <w:r>
-        <w:instrText xml:space="preserve"> PAGEREF _Toc31312 \h </w:instrText>
+        <w:instrText xml:space="preserve"> PAGEREF _Toc5520 \h </w:instrText>
       </w:r>
       <w:r>
         <w:fldChar w:fldCharType="separate"/>
@@ -550,7 +550,7 @@
         <w:fldChar w:fldCharType="begin"/>
       </w:r>
       <w:r>
-        <w:instrText xml:space="preserve"> HYPERLINK \l _Toc2053 </w:instrText>
+        <w:instrText xml:space="preserve"> HYPERLINK \l _Toc31674 </w:instrText>
       </w:r>
       <w:r>
         <w:fldChar w:fldCharType="separate"/>
@@ -568,7 +568,7 @@
         <w:fldChar w:fldCharType="begin"/>
       </w:r>
       <w:r>
-        <w:instrText xml:space="preserve"> PAGEREF _Toc2053 \h </w:instrText>
+        <w:instrText xml:space="preserve"> PAGEREF _Toc31674 \h </w:instrText>
       </w:r>
       <w:r>
         <w:fldChar w:fldCharType="separate"/>
@@ -594,7 +594,7 @@
         <w:fldChar w:fldCharType="begin"/>
       </w:r>
       <w:r>
-        <w:instrText xml:space="preserve"> HYPERLINK \l _Toc28472 </w:instrText>
+        <w:instrText xml:space="preserve"> HYPERLINK \l _Toc19100 </w:instrText>
       </w:r>
       <w:r>
         <w:fldChar w:fldCharType="separate"/>
@@ -612,7 +612,7 @@
         <w:fldChar w:fldCharType="begin"/>
       </w:r>
       <w:r>
-        <w:instrText xml:space="preserve"> PAGEREF _Toc28472 \h </w:instrText>
+        <w:instrText xml:space="preserve"> PAGEREF _Toc19100 \h </w:instrText>
       </w:r>
       <w:r>
         <w:fldChar w:fldCharType="separate"/>
@@ -638,7 +638,7 @@
         <w:fldChar w:fldCharType="begin"/>
       </w:r>
       <w:r>
-        <w:instrText xml:space="preserve"> HYPERLINK \l _Toc15961 </w:instrText>
+        <w:instrText xml:space="preserve"> HYPERLINK \l _Toc29701 </w:instrText>
       </w:r>
       <w:r>
         <w:fldChar w:fldCharType="separate"/>
@@ -656,7 +656,7 @@
         <w:fldChar w:fldCharType="begin"/>
       </w:r>
       <w:r>
-        <w:instrText xml:space="preserve"> PAGEREF _Toc15961 \h </w:instrText>
+        <w:instrText xml:space="preserve"> PAGEREF _Toc29701 \h </w:instrText>
       </w:r>
       <w:r>
         <w:fldChar w:fldCharType="separate"/>
@@ -682,7 +682,7 @@
         <w:fldChar w:fldCharType="begin"/>
       </w:r>
       <w:r>
-        <w:instrText xml:space="preserve"> HYPERLINK \l _Toc25015 </w:instrText>
+        <w:instrText xml:space="preserve"> HYPERLINK \l _Toc10001 </w:instrText>
       </w:r>
       <w:r>
         <w:fldChar w:fldCharType="separate"/>
@@ -700,7 +700,7 @@
         <w:fldChar w:fldCharType="begin"/>
       </w:r>
       <w:r>
-        <w:instrText xml:space="preserve"> PAGEREF _Toc25015 \h </w:instrText>
+        <w:instrText xml:space="preserve"> PAGEREF _Toc10001 \h </w:instrText>
       </w:r>
       <w:r>
         <w:fldChar w:fldCharType="separate"/>
@@ -726,7 +726,7 @@
         <w:fldChar w:fldCharType="begin"/>
       </w:r>
       <w:r>
-        <w:instrText xml:space="preserve"> HYPERLINK \l _Toc10382 </w:instrText>
+        <w:instrText xml:space="preserve"> HYPERLINK \l _Toc27590 </w:instrText>
       </w:r>
       <w:r>
         <w:fldChar w:fldCharType="separate"/>
@@ -744,7 +744,7 @@
         <w:fldChar w:fldCharType="begin"/>
       </w:r>
       <w:r>
-        <w:instrText xml:space="preserve"> PAGEREF _Toc10382 \h </w:instrText>
+        <w:instrText xml:space="preserve"> PAGEREF _Toc27590 \h </w:instrText>
       </w:r>
       <w:r>
         <w:fldChar w:fldCharType="separate"/>
@@ -770,7 +770,7 @@
         <w:fldChar w:fldCharType="begin"/>
       </w:r>
       <w:r>
-        <w:instrText xml:space="preserve"> HYPERLINK \l _Toc22432 </w:instrText>
+        <w:instrText xml:space="preserve"> HYPERLINK \l _Toc263 </w:instrText>
       </w:r>
       <w:r>
         <w:fldChar w:fldCharType="separate"/>
@@ -788,7 +788,7 @@
         <w:fldChar w:fldCharType="begin"/>
       </w:r>
       <w:r>
-        <w:instrText xml:space="preserve"> PAGEREF _Toc22432 \h </w:instrText>
+        <w:instrText xml:space="preserve"> PAGEREF _Toc263 \h </w:instrText>
       </w:r>
       <w:r>
         <w:fldChar w:fldCharType="separate"/>
@@ -814,7 +814,7 @@
         <w:fldChar w:fldCharType="begin"/>
       </w:r>
       <w:r>
-        <w:instrText xml:space="preserve"> HYPERLINK \l _Toc15445 </w:instrText>
+        <w:instrText xml:space="preserve"> HYPERLINK \l _Toc24660 </w:instrText>
       </w:r>
       <w:r>
         <w:fldChar w:fldCharType="separate"/>
@@ -832,7 +832,7 @@
         <w:fldChar w:fldCharType="begin"/>
       </w:r>
       <w:r>
-        <w:instrText xml:space="preserve"> PAGEREF _Toc15445 \h </w:instrText>
+        <w:instrText xml:space="preserve"> PAGEREF _Toc24660 \h </w:instrText>
       </w:r>
       <w:r>
         <w:fldChar w:fldCharType="separate"/>
@@ -858,7 +858,7 @@
         <w:fldChar w:fldCharType="begin"/>
       </w:r>
       <w:r>
-        <w:instrText xml:space="preserve"> HYPERLINK \l _Toc617 </w:instrText>
+        <w:instrText xml:space="preserve"> HYPERLINK \l _Toc18865 </w:instrText>
       </w:r>
       <w:r>
         <w:fldChar w:fldCharType="separate"/>
@@ -876,7 +876,7 @@
         <w:fldChar w:fldCharType="begin"/>
       </w:r>
       <w:r>
-        <w:instrText xml:space="preserve"> PAGEREF _Toc617 \h </w:instrText>
+        <w:instrText xml:space="preserve"> PAGEREF _Toc18865 \h </w:instrText>
       </w:r>
       <w:r>
         <w:fldChar w:fldCharType="separate"/>
@@ -902,7 +902,7 @@
         <w:fldChar w:fldCharType="begin"/>
       </w:r>
       <w:r>
-        <w:instrText xml:space="preserve"> HYPERLINK \l _Toc13765 </w:instrText>
+        <w:instrText xml:space="preserve"> HYPERLINK \l _Toc2684 </w:instrText>
       </w:r>
       <w:r>
         <w:fldChar w:fldCharType="separate"/>
@@ -920,7 +920,7 @@
         <w:fldChar w:fldCharType="begin"/>
       </w:r>
       <w:r>
-        <w:instrText xml:space="preserve"> PAGEREF _Toc13765 \h </w:instrText>
+        <w:instrText xml:space="preserve"> PAGEREF _Toc2684 \h </w:instrText>
       </w:r>
       <w:r>
         <w:fldChar w:fldCharType="separate"/>
@@ -946,7 +946,7 @@
         <w:fldChar w:fldCharType="begin"/>
       </w:r>
       <w:r>
-        <w:instrText xml:space="preserve"> HYPERLINK \l _Toc9306 </w:instrText>
+        <w:instrText xml:space="preserve"> HYPERLINK \l _Toc22889 </w:instrText>
       </w:r>
       <w:r>
         <w:fldChar w:fldCharType="separate"/>
@@ -964,7 +964,7 @@
         <w:fldChar w:fldCharType="begin"/>
       </w:r>
       <w:r>
-        <w:instrText xml:space="preserve"> PAGEREF _Toc9306 \h </w:instrText>
+        <w:instrText xml:space="preserve"> PAGEREF _Toc22889 \h </w:instrText>
       </w:r>
       <w:r>
         <w:fldChar w:fldCharType="separate"/>
@@ -990,7 +990,7 @@
         <w:fldChar w:fldCharType="begin"/>
       </w:r>
       <w:r>
-        <w:instrText xml:space="preserve"> HYPERLINK \l _Toc12878 </w:instrText>
+        <w:instrText xml:space="preserve"> HYPERLINK \l _Toc24813 </w:instrText>
       </w:r>
       <w:r>
         <w:fldChar w:fldCharType="separate"/>
@@ -1008,7 +1008,7 @@
         <w:fldChar w:fldCharType="begin"/>
       </w:r>
       <w:r>
-        <w:instrText xml:space="preserve"> PAGEREF _Toc12878 \h </w:instrText>
+        <w:instrText xml:space="preserve"> PAGEREF _Toc24813 \h </w:instrText>
       </w:r>
       <w:r>
         <w:fldChar w:fldCharType="separate"/>
@@ -1034,7 +1034,7 @@
         <w:fldChar w:fldCharType="begin"/>
       </w:r>
       <w:r>
-        <w:instrText xml:space="preserve"> HYPERLINK \l _Toc24645 </w:instrText>
+        <w:instrText xml:space="preserve"> HYPERLINK \l _Toc13551 </w:instrText>
       </w:r>
       <w:r>
         <w:fldChar w:fldCharType="separate"/>
@@ -1052,7 +1052,7 @@
         <w:fldChar w:fldCharType="begin"/>
       </w:r>
       <w:r>
-        <w:instrText xml:space="preserve"> PAGEREF _Toc24645 \h </w:instrText>
+        <w:instrText xml:space="preserve"> PAGEREF _Toc13551 \h </w:instrText>
       </w:r>
       <w:r>
         <w:fldChar w:fldCharType="separate"/>
@@ -1078,7 +1078,7 @@
         <w:fldChar w:fldCharType="begin"/>
       </w:r>
       <w:r>
-        <w:instrText xml:space="preserve"> HYPERLINK \l _Toc24601 </w:instrText>
+        <w:instrText xml:space="preserve"> HYPERLINK \l _Toc25324 </w:instrText>
       </w:r>
       <w:r>
         <w:fldChar w:fldCharType="separate"/>
@@ -1096,7 +1096,7 @@
         <w:fldChar w:fldCharType="begin"/>
       </w:r>
       <w:r>
-        <w:instrText xml:space="preserve"> PAGEREF _Toc24601 \h </w:instrText>
+        <w:instrText xml:space="preserve"> PAGEREF _Toc25324 \h </w:instrText>
       </w:r>
       <w:r>
         <w:fldChar w:fldCharType="separate"/>
@@ -1122,7 +1122,7 @@
         <w:fldChar w:fldCharType="begin"/>
       </w:r>
       <w:r>
-        <w:instrText xml:space="preserve"> HYPERLINK \l _Toc20453 </w:instrText>
+        <w:instrText xml:space="preserve"> HYPERLINK \l _Toc24025 </w:instrText>
       </w:r>
       <w:r>
         <w:fldChar w:fldCharType="separate"/>
@@ -1140,7 +1140,7 @@
         <w:fldChar w:fldCharType="begin"/>
       </w:r>
       <w:r>
-        <w:instrText xml:space="preserve"> PAGEREF _Toc20453 \h </w:instrText>
+        <w:instrText xml:space="preserve"> PAGEREF _Toc24025 \h </w:instrText>
       </w:r>
       <w:r>
         <w:fldChar w:fldCharType="separate"/>
@@ -1166,7 +1166,7 @@
         <w:fldChar w:fldCharType="begin"/>
       </w:r>
       <w:r>
-        <w:instrText xml:space="preserve"> HYPERLINK \l _Toc19803 </w:instrText>
+        <w:instrText xml:space="preserve"> HYPERLINK \l _Toc5525 </w:instrText>
       </w:r>
       <w:r>
         <w:fldChar w:fldCharType="separate"/>
@@ -1184,7 +1184,7 @@
         <w:fldChar w:fldCharType="begin"/>
       </w:r>
       <w:r>
-        <w:instrText xml:space="preserve"> PAGEREF _Toc19803 \h </w:instrText>
+        <w:instrText xml:space="preserve"> PAGEREF _Toc5525 \h </w:instrText>
       </w:r>
       <w:r>
         <w:fldChar w:fldCharType="separate"/>
@@ -1210,7 +1210,7 @@
         <w:fldChar w:fldCharType="begin"/>
       </w:r>
       <w:r>
-        <w:instrText xml:space="preserve"> HYPERLINK \l _Toc24153 </w:instrText>
+        <w:instrText xml:space="preserve"> HYPERLINK \l _Toc3909 </w:instrText>
       </w:r>
       <w:r>
         <w:fldChar w:fldCharType="separate"/>
@@ -1228,7 +1228,7 @@
         <w:fldChar w:fldCharType="begin"/>
       </w:r>
       <w:r>
-        <w:instrText xml:space="preserve"> PAGEREF _Toc24153 \h </w:instrText>
+        <w:instrText xml:space="preserve"> PAGEREF _Toc3909 \h </w:instrText>
       </w:r>
       <w:r>
         <w:fldChar w:fldCharType="separate"/>
@@ -1254,7 +1254,7 @@
         <w:fldChar w:fldCharType="begin"/>
       </w:r>
       <w:r>
-        <w:instrText xml:space="preserve"> HYPERLINK \l _Toc32627 </w:instrText>
+        <w:instrText xml:space="preserve"> HYPERLINK \l _Toc12344 </w:instrText>
       </w:r>
       <w:r>
         <w:fldChar w:fldCharType="separate"/>
@@ -1272,7 +1272,7 @@
         <w:fldChar w:fldCharType="begin"/>
       </w:r>
       <w:r>
-        <w:instrText xml:space="preserve"> PAGEREF _Toc32627 \h </w:instrText>
+        <w:instrText xml:space="preserve"> PAGEREF _Toc12344 \h </w:instrText>
       </w:r>
       <w:r>
         <w:fldChar w:fldCharType="separate"/>
@@ -1298,7 +1298,7 @@
         <w:fldChar w:fldCharType="begin"/>
       </w:r>
       <w:r>
-        <w:instrText xml:space="preserve"> HYPERLINK \l _Toc3926 </w:instrText>
+        <w:instrText xml:space="preserve"> HYPERLINK \l _Toc4422 </w:instrText>
       </w:r>
       <w:r>
         <w:fldChar w:fldCharType="separate"/>
@@ -1316,7 +1316,7 @@
         <w:fldChar w:fldCharType="begin"/>
       </w:r>
       <w:r>
-        <w:instrText xml:space="preserve"> PAGEREF _Toc3926 \h </w:instrText>
+        <w:instrText xml:space="preserve"> PAGEREF _Toc4422 \h </w:instrText>
       </w:r>
       <w:r>
         <w:fldChar w:fldCharType="separate"/>
@@ -1342,7 +1342,7 @@
         <w:fldChar w:fldCharType="begin"/>
       </w:r>
       <w:r>
-        <w:instrText xml:space="preserve"> HYPERLINK \l _Toc30667 </w:instrText>
+        <w:instrText xml:space="preserve"> HYPERLINK \l _Toc6294 </w:instrText>
       </w:r>
       <w:r>
         <w:fldChar w:fldCharType="separate"/>
@@ -1360,7 +1360,7 @@
         <w:fldChar w:fldCharType="begin"/>
       </w:r>
       <w:r>
-        <w:instrText xml:space="preserve"> PAGEREF _Toc30667 \h </w:instrText>
+        <w:instrText xml:space="preserve"> PAGEREF _Toc6294 \h </w:instrText>
       </w:r>
       <w:r>
         <w:fldChar w:fldCharType="separate"/>
@@ -1386,7 +1386,7 @@
         <w:fldChar w:fldCharType="begin"/>
       </w:r>
       <w:r>
-        <w:instrText xml:space="preserve"> HYPERLINK \l _Toc24835 </w:instrText>
+        <w:instrText xml:space="preserve"> HYPERLINK \l _Toc24749 </w:instrText>
       </w:r>
       <w:r>
         <w:fldChar w:fldCharType="separate"/>
@@ -1404,7 +1404,7 @@
         <w:fldChar w:fldCharType="begin"/>
       </w:r>
       <w:r>
-        <w:instrText xml:space="preserve"> PAGEREF _Toc24835 \h </w:instrText>
+        <w:instrText xml:space="preserve"> PAGEREF _Toc24749 \h </w:instrText>
       </w:r>
       <w:r>
         <w:fldChar w:fldCharType="separate"/>
@@ -1430,7 +1430,7 @@
         <w:fldChar w:fldCharType="begin"/>
       </w:r>
       <w:r>
-        <w:instrText xml:space="preserve"> HYPERLINK \l _Toc15561 </w:instrText>
+        <w:instrText xml:space="preserve"> HYPERLINK \l _Toc5636 </w:instrText>
       </w:r>
       <w:r>
         <w:fldChar w:fldCharType="separate"/>
@@ -1448,7 +1448,7 @@
         <w:fldChar w:fldCharType="begin"/>
       </w:r>
       <w:r>
-        <w:instrText xml:space="preserve"> PAGEREF _Toc15561 \h </w:instrText>
+        <w:instrText xml:space="preserve"> PAGEREF _Toc5636 \h </w:instrText>
       </w:r>
       <w:r>
         <w:fldChar w:fldCharType="separate"/>
@@ -1474,7 +1474,7 @@
         <w:fldChar w:fldCharType="begin"/>
       </w:r>
       <w:r>
-        <w:instrText xml:space="preserve"> HYPERLINK \l _Toc9629 </w:instrText>
+        <w:instrText xml:space="preserve"> HYPERLINK \l _Toc5654 </w:instrText>
       </w:r>
       <w:r>
         <w:fldChar w:fldCharType="separate"/>
@@ -1492,7 +1492,7 @@
         <w:fldChar w:fldCharType="begin"/>
       </w:r>
       <w:r>
-        <w:instrText xml:space="preserve"> PAGEREF _Toc9629 \h </w:instrText>
+        <w:instrText xml:space="preserve"> PAGEREF _Toc5654 \h </w:instrText>
       </w:r>
       <w:r>
         <w:fldChar w:fldCharType="separate"/>
@@ -1518,7 +1518,7 @@
         <w:fldChar w:fldCharType="begin"/>
       </w:r>
       <w:r>
-        <w:instrText xml:space="preserve"> HYPERLINK \l _Toc28509 </w:instrText>
+        <w:instrText xml:space="preserve"> HYPERLINK \l _Toc6858 </w:instrText>
       </w:r>
       <w:r>
         <w:fldChar w:fldCharType="separate"/>
@@ -1536,7 +1536,7 @@
         <w:fldChar w:fldCharType="begin"/>
       </w:r>
       <w:r>
-        <w:instrText xml:space="preserve"> PAGEREF _Toc28509 \h </w:instrText>
+        <w:instrText xml:space="preserve"> PAGEREF _Toc6858 \h </w:instrText>
       </w:r>
       <w:r>
         <w:fldChar w:fldCharType="separate"/>
@@ -1562,7 +1562,7 @@
         <w:fldChar w:fldCharType="begin"/>
       </w:r>
       <w:r>
-        <w:instrText xml:space="preserve"> HYPERLINK \l _Toc23381 </w:instrText>
+        <w:instrText xml:space="preserve"> HYPERLINK \l _Toc3684 </w:instrText>
       </w:r>
       <w:r>
         <w:fldChar w:fldCharType="separate"/>
@@ -1580,7 +1580,7 @@
         <w:fldChar w:fldCharType="begin"/>
       </w:r>
       <w:r>
-        <w:instrText xml:space="preserve"> PAGEREF _Toc23381 \h </w:instrText>
+        <w:instrText xml:space="preserve"> PAGEREF _Toc3684 \h </w:instrText>
       </w:r>
       <w:r>
         <w:fldChar w:fldCharType="separate"/>
@@ -1606,7 +1606,7 @@
         <w:fldChar w:fldCharType="begin"/>
       </w:r>
       <w:r>
-        <w:instrText xml:space="preserve"> HYPERLINK \l _Toc31216 </w:instrText>
+        <w:instrText xml:space="preserve"> HYPERLINK \l _Toc15657 </w:instrText>
       </w:r>
       <w:r>
         <w:fldChar w:fldCharType="separate"/>
@@ -1624,7 +1624,7 @@
         <w:fldChar w:fldCharType="begin"/>
       </w:r>
       <w:r>
-        <w:instrText xml:space="preserve"> PAGEREF _Toc31216 \h </w:instrText>
+        <w:instrText xml:space="preserve"> PAGEREF _Toc15657 \h </w:instrText>
       </w:r>
       <w:r>
         <w:fldChar w:fldCharType="separate"/>
@@ -1650,7 +1650,7 @@
         <w:fldChar w:fldCharType="begin"/>
       </w:r>
       <w:r>
-        <w:instrText xml:space="preserve"> HYPERLINK \l _Toc31753 </w:instrText>
+        <w:instrText xml:space="preserve"> HYPERLINK \l _Toc10254 </w:instrText>
       </w:r>
       <w:r>
         <w:fldChar w:fldCharType="separate"/>
@@ -1668,7 +1668,7 @@
         <w:fldChar w:fldCharType="begin"/>
       </w:r>
       <w:r>
-        <w:instrText xml:space="preserve"> PAGEREF _Toc31753 \h </w:instrText>
+        <w:instrText xml:space="preserve"> PAGEREF _Toc10254 \h </w:instrText>
       </w:r>
       <w:r>
         <w:fldChar w:fldCharType="separate"/>
@@ -1694,7 +1694,7 @@
         <w:fldChar w:fldCharType="begin"/>
       </w:r>
       <w:r>
-        <w:instrText xml:space="preserve"> HYPERLINK \l _Toc2996 </w:instrText>
+        <w:instrText xml:space="preserve"> HYPERLINK \l _Toc1525 </w:instrText>
       </w:r>
       <w:r>
         <w:fldChar w:fldCharType="separate"/>
@@ -1712,7 +1712,7 @@
         <w:fldChar w:fldCharType="begin"/>
       </w:r>
       <w:r>
-        <w:instrText xml:space="preserve"> PAGEREF _Toc2996 \h </w:instrText>
+        <w:instrText xml:space="preserve"> PAGEREF _Toc1525 \h </w:instrText>
       </w:r>
       <w:r>
         <w:fldChar w:fldCharType="separate"/>
@@ -1738,7 +1738,7 @@
         <w:fldChar w:fldCharType="begin"/>
       </w:r>
       <w:r>
-        <w:instrText xml:space="preserve"> HYPERLINK \l _Toc19390 </w:instrText>
+        <w:instrText xml:space="preserve"> HYPERLINK \l _Toc17390 </w:instrText>
       </w:r>
       <w:r>
         <w:fldChar w:fldCharType="separate"/>
@@ -1756,7 +1756,7 @@
         <w:fldChar w:fldCharType="begin"/>
       </w:r>
       <w:r>
-        <w:instrText xml:space="preserve"> PAGEREF _Toc19390 \h </w:instrText>
+        <w:instrText xml:space="preserve"> PAGEREF _Toc17390 \h </w:instrText>
       </w:r>
       <w:r>
         <w:fldChar w:fldCharType="separate"/>
@@ -1782,7 +1782,7 @@
         <w:fldChar w:fldCharType="begin"/>
       </w:r>
       <w:r>
-        <w:instrText xml:space="preserve"> HYPERLINK \l _Toc27569 </w:instrText>
+        <w:instrText xml:space="preserve"> HYPERLINK \l _Toc10409 </w:instrText>
       </w:r>
       <w:r>
         <w:fldChar w:fldCharType="separate"/>
@@ -1800,7 +1800,7 @@
         <w:fldChar w:fldCharType="begin"/>
       </w:r>
       <w:r>
-        <w:instrText xml:space="preserve"> PAGEREF _Toc27569 \h </w:instrText>
+        <w:instrText xml:space="preserve"> PAGEREF _Toc10409 \h </w:instrText>
       </w:r>
       <w:r>
         <w:fldChar w:fldCharType="separate"/>
@@ -1826,7 +1826,7 @@
         <w:fldChar w:fldCharType="begin"/>
       </w:r>
       <w:r>
-        <w:instrText xml:space="preserve"> HYPERLINK \l _Toc9231 </w:instrText>
+        <w:instrText xml:space="preserve"> HYPERLINK \l _Toc28018 </w:instrText>
       </w:r>
       <w:r>
         <w:fldChar w:fldCharType="separate"/>
@@ -1844,7 +1844,7 @@
         <w:fldChar w:fldCharType="begin"/>
       </w:r>
       <w:r>
-        <w:instrText xml:space="preserve"> PAGEREF _Toc9231 \h </w:instrText>
+        <w:instrText xml:space="preserve"> PAGEREF _Toc28018 \h </w:instrText>
       </w:r>
       <w:r>
         <w:fldChar w:fldCharType="separate"/>
@@ -1870,7 +1870,7 @@
         <w:fldChar w:fldCharType="begin"/>
       </w:r>
       <w:r>
-        <w:instrText xml:space="preserve"> HYPERLINK \l _Toc18693 </w:instrText>
+        <w:instrText xml:space="preserve"> HYPERLINK \l _Toc6487 </w:instrText>
       </w:r>
       <w:r>
         <w:fldChar w:fldCharType="separate"/>
@@ -1888,7 +1888,7 @@
         <w:fldChar w:fldCharType="begin"/>
       </w:r>
       <w:r>
-        <w:instrText xml:space="preserve"> PAGEREF _Toc18693 \h </w:instrText>
+        <w:instrText xml:space="preserve"> PAGEREF _Toc6487 \h </w:instrText>
       </w:r>
       <w:r>
         <w:fldChar w:fldCharType="separate"/>
@@ -1914,7 +1914,7 @@
         <w:fldChar w:fldCharType="begin"/>
       </w:r>
       <w:r>
-        <w:instrText xml:space="preserve"> HYPERLINK \l _Toc27623 </w:instrText>
+        <w:instrText xml:space="preserve"> HYPERLINK \l _Toc27994 </w:instrText>
       </w:r>
       <w:r>
         <w:fldChar w:fldCharType="separate"/>
@@ -1932,7 +1932,7 @@
         <w:fldChar w:fldCharType="begin"/>
       </w:r>
       <w:r>
-        <w:instrText xml:space="preserve"> PAGEREF _Toc27623 \h </w:instrText>
+        <w:instrText xml:space="preserve"> PAGEREF _Toc27994 \h </w:instrText>
       </w:r>
       <w:r>
         <w:fldChar w:fldCharType="separate"/>
@@ -1958,7 +1958,7 @@
         <w:fldChar w:fldCharType="begin"/>
       </w:r>
       <w:r>
-        <w:instrText xml:space="preserve"> HYPERLINK \l _Toc6688 </w:instrText>
+        <w:instrText xml:space="preserve"> HYPERLINK \l _Toc22248 </w:instrText>
       </w:r>
       <w:r>
         <w:fldChar w:fldCharType="separate"/>
@@ -1976,7 +1976,7 @@
         <w:fldChar w:fldCharType="begin"/>
       </w:r>
       <w:r>
-        <w:instrText xml:space="preserve"> PAGEREF _Toc6688 \h </w:instrText>
+        <w:instrText xml:space="preserve"> PAGEREF _Toc22248 \h </w:instrText>
       </w:r>
       <w:r>
         <w:fldChar w:fldCharType="separate"/>
@@ -2002,7 +2002,7 @@
         <w:fldChar w:fldCharType="begin"/>
       </w:r>
       <w:r>
-        <w:instrText xml:space="preserve"> HYPERLINK \l _Toc9799 </w:instrText>
+        <w:instrText xml:space="preserve"> HYPERLINK \l _Toc25453 </w:instrText>
       </w:r>
       <w:r>
         <w:fldChar w:fldCharType="separate"/>
@@ -2020,7 +2020,7 @@
         <w:fldChar w:fldCharType="begin"/>
       </w:r>
       <w:r>
-        <w:instrText xml:space="preserve"> PAGEREF _Toc9799 \h </w:instrText>
+        <w:instrText xml:space="preserve"> PAGEREF _Toc25453 \h </w:instrText>
       </w:r>
       <w:r>
         <w:fldChar w:fldCharType="separate"/>
@@ -2046,7 +2046,7 @@
         <w:fldChar w:fldCharType="begin"/>
       </w:r>
       <w:r>
-        <w:instrText xml:space="preserve"> HYPERLINK \l _Toc27411 </w:instrText>
+        <w:instrText xml:space="preserve"> HYPERLINK \l _Toc13442 </w:instrText>
       </w:r>
       <w:r>
         <w:fldChar w:fldCharType="separate"/>
@@ -2064,7 +2064,7 @@
         <w:fldChar w:fldCharType="begin"/>
       </w:r>
       <w:r>
-        <w:instrText xml:space="preserve"> PAGEREF _Toc27411 \h </w:instrText>
+        <w:instrText xml:space="preserve"> PAGEREF _Toc13442 \h </w:instrText>
       </w:r>
       <w:r>
         <w:fldChar w:fldCharType="separate"/>
@@ -2090,7 +2090,7 @@
         <w:fldChar w:fldCharType="begin"/>
       </w:r>
       <w:r>
-        <w:instrText xml:space="preserve"> HYPERLINK \l _Toc6108 </w:instrText>
+        <w:instrText xml:space="preserve"> HYPERLINK \l _Toc9927 </w:instrText>
       </w:r>
       <w:r>
         <w:fldChar w:fldCharType="separate"/>
@@ -2108,7 +2108,7 @@
         <w:fldChar w:fldCharType="begin"/>
       </w:r>
       <w:r>
-        <w:instrText xml:space="preserve"> PAGEREF _Toc6108 \h </w:instrText>
+        <w:instrText xml:space="preserve"> PAGEREF _Toc9927 \h </w:instrText>
       </w:r>
       <w:r>
         <w:fldChar w:fldCharType="separate"/>
@@ -2134,7 +2134,7 @@
         <w:fldChar w:fldCharType="begin"/>
       </w:r>
       <w:r>
-        <w:instrText xml:space="preserve"> HYPERLINK \l _Toc15145 </w:instrText>
+        <w:instrText xml:space="preserve"> HYPERLINK \l _Toc793 </w:instrText>
       </w:r>
       <w:r>
         <w:fldChar w:fldCharType="separate"/>
@@ -2152,7 +2152,7 @@
         <w:fldChar w:fldCharType="begin"/>
       </w:r>
       <w:r>
-        <w:instrText xml:space="preserve"> PAGEREF _Toc15145 \h </w:instrText>
+        <w:instrText xml:space="preserve"> PAGEREF _Toc793 \h </w:instrText>
       </w:r>
       <w:r>
         <w:fldChar w:fldCharType="separate"/>
@@ -2178,7 +2178,7 @@
         <w:fldChar w:fldCharType="begin"/>
       </w:r>
       <w:r>
-        <w:instrText xml:space="preserve"> HYPERLINK \l _Toc17079 </w:instrText>
+        <w:instrText xml:space="preserve"> HYPERLINK \l _Toc27058 </w:instrText>
       </w:r>
       <w:r>
         <w:fldChar w:fldCharType="separate"/>
@@ -2196,7 +2196,7 @@
         <w:fldChar w:fldCharType="begin"/>
       </w:r>
       <w:r>
-        <w:instrText xml:space="preserve"> PAGEREF _Toc17079 \h </w:instrText>
+        <w:instrText xml:space="preserve"> PAGEREF _Toc27058 \h </w:instrText>
       </w:r>
       <w:r>
         <w:fldChar w:fldCharType="separate"/>
@@ -2222,7 +2222,7 @@
         <w:fldChar w:fldCharType="begin"/>
       </w:r>
       <w:r>
-        <w:instrText xml:space="preserve"> HYPERLINK \l _Toc19549 </w:instrText>
+        <w:instrText xml:space="preserve"> HYPERLINK \l _Toc17514 </w:instrText>
       </w:r>
       <w:r>
         <w:fldChar w:fldCharType="separate"/>
@@ -2240,7 +2240,7 @@
         <w:fldChar w:fldCharType="begin"/>
       </w:r>
       <w:r>
-        <w:instrText xml:space="preserve"> PAGEREF _Toc19549 \h </w:instrText>
+        <w:instrText xml:space="preserve"> PAGEREF _Toc17514 \h </w:instrText>
       </w:r>
       <w:r>
         <w:fldChar w:fldCharType="separate"/>
@@ -2266,7 +2266,7 @@
         <w:fldChar w:fldCharType="begin"/>
       </w:r>
       <w:r>
-        <w:instrText xml:space="preserve"> HYPERLINK \l _Toc12396 </w:instrText>
+        <w:instrText xml:space="preserve"> HYPERLINK \l _Toc17703 </w:instrText>
       </w:r>
       <w:r>
         <w:fldChar w:fldCharType="separate"/>
@@ -2284,7 +2284,7 @@
         <w:fldChar w:fldCharType="begin"/>
       </w:r>
       <w:r>
-        <w:instrText xml:space="preserve"> PAGEREF _Toc12396 \h </w:instrText>
+        <w:instrText xml:space="preserve"> PAGEREF _Toc17703 \h </w:instrText>
       </w:r>
       <w:r>
         <w:fldChar w:fldCharType="separate"/>
@@ -2310,7 +2310,7 @@
         <w:fldChar w:fldCharType="begin"/>
       </w:r>
       <w:r>
-        <w:instrText xml:space="preserve"> HYPERLINK \l _Toc7020 </w:instrText>
+        <w:instrText xml:space="preserve"> HYPERLINK \l _Toc6902 </w:instrText>
       </w:r>
       <w:r>
         <w:fldChar w:fldCharType="separate"/>
@@ -2328,7 +2328,7 @@
         <w:fldChar w:fldCharType="begin"/>
       </w:r>
       <w:r>
-        <w:instrText xml:space="preserve"> PAGEREF _Toc7020 \h </w:instrText>
+        <w:instrText xml:space="preserve"> PAGEREF _Toc6902 \h </w:instrText>
       </w:r>
       <w:r>
         <w:fldChar w:fldCharType="separate"/>
@@ -2346,18 +2346,14 @@
     <w:p>
       <w:r>
         <w:fldChar w:fldCharType="end"/>
-      </w:r>
-    </w:p>
-    <w:p>
-      <w:r>
-        <w:br w:type="page"/>
       </w:r>
     </w:p>
     <w:p>
       <w:pPr>
         <w:pStyle w:val="4"/>
+        <w:pageBreakBefore/>
       </w:pPr>
-      <w:bookmarkStart w:id="0" w:name="_Toc14649"/>
+      <w:bookmarkStart w:id="0" w:name="_Toc3456"/>
       <w:r>
         <w:rPr>
           <w:rFonts w:ascii="宋体" w:hAnsi="宋体" w:eastAsia="宋体"/>
@@ -2372,7 +2368,7 @@
       <w:pPr>
         <w:pStyle w:val="5"/>
       </w:pPr>
-      <w:bookmarkStart w:id="1" w:name="_Toc3721"/>
+      <w:bookmarkStart w:id="1" w:name="_Toc11491"/>
       <w:r>
         <w:rPr>
           <w:rFonts w:ascii="宋体" w:hAnsi="宋体" w:eastAsia="宋体"/>
@@ -2417,7 +2413,7 @@
       <w:pPr>
         <w:pStyle w:val="5"/>
       </w:pPr>
-      <w:bookmarkStart w:id="2" w:name="_Toc31312"/>
+      <w:bookmarkStart w:id="2" w:name="_Toc5520"/>
       <w:r>
         <w:rPr>
           <w:rFonts w:ascii="宋体" w:hAnsi="宋体" w:eastAsia="宋体"/>
@@ -2858,7 +2854,7 @@
                 <w:b w:val="0"/>
                 <w:sz w:val="17"/>
               </w:rPr>
-              <w:t>pytest 自动化测试共 133 条，编制本计划时的项目快照为全部通过；正式验收以冻结版本的实际执行结果为准</w:t>
+              <w:t>pytest 自动化测试共 136 条，编制本计划时的项目快照为全部通过；正式验收以冻结版本的实际执行结果为准</w:t>
             </w:r>
           </w:p>
         </w:tc>
@@ -3035,7 +3031,7 @@
       <w:pPr>
         <w:pStyle w:val="5"/>
       </w:pPr>
-      <w:bookmarkStart w:id="3" w:name="_Toc2053"/>
+      <w:bookmarkStart w:id="3" w:name="_Toc31674"/>
       <w:r>
         <w:rPr>
           <w:rFonts w:ascii="宋体" w:hAnsi="宋体" w:eastAsia="宋体"/>
@@ -3653,7 +3649,7 @@
       <w:pPr>
         <w:pStyle w:val="5"/>
       </w:pPr>
-      <w:bookmarkStart w:id="4" w:name="_Toc28472"/>
+      <w:bookmarkStart w:id="4" w:name="_Toc19100"/>
       <w:r>
         <w:rPr>
           <w:rFonts w:ascii="宋体" w:hAnsi="宋体" w:eastAsia="宋体"/>
@@ -5082,7 +5078,7 @@
       <w:pPr>
         <w:pStyle w:val="5"/>
       </w:pPr>
-      <w:bookmarkStart w:id="5" w:name="_Toc15961"/>
+      <w:bookmarkStart w:id="5" w:name="_Toc29701"/>
       <w:r>
         <w:rPr>
           <w:rFonts w:ascii="宋体" w:hAnsi="宋体" w:eastAsia="宋体"/>
@@ -5160,14 +5156,14 @@
           <w:b w:val="0"/>
           <w:sz w:val="21"/>
         </w:rPr>
-        <w:t>所有关键交付物以 2026-10-29 的冻结版本为准；编制计划时的 133 条测试结果视为项目快照，最终验收需重新执行。</w:t>
+        <w:t>所有关键交付物以 2026-10-31 的冻结版本为准；编制计划时的 136 条测试结果视为项目快照，最终验收需重新执行。</w:t>
       </w:r>
     </w:p>
     <w:p>
       <w:pPr>
         <w:pStyle w:val="4"/>
       </w:pPr>
-      <w:bookmarkStart w:id="6" w:name="_Toc25015"/>
+      <w:bookmarkStart w:id="6" w:name="_Toc10001"/>
       <w:r>
         <w:rPr>
           <w:rFonts w:ascii="宋体" w:hAnsi="宋体" w:eastAsia="宋体"/>
@@ -5182,7 +5178,7 @@
       <w:pPr>
         <w:pStyle w:val="5"/>
       </w:pPr>
-      <w:bookmarkStart w:id="7" w:name="_Toc10382"/>
+      <w:bookmarkStart w:id="7" w:name="_Toc27590"/>
       <w:r>
         <w:rPr>
           <w:rFonts w:ascii="宋体" w:hAnsi="宋体" w:eastAsia="宋体"/>
@@ -5217,7 +5213,7 @@
       <w:pPr>
         <w:pStyle w:val="5"/>
       </w:pPr>
-      <w:bookmarkStart w:id="8" w:name="_Toc22432"/>
+      <w:bookmarkStart w:id="8" w:name="_Toc263"/>
       <w:r>
         <w:rPr>
           <w:rFonts w:ascii="宋体" w:hAnsi="宋体" w:eastAsia="宋体"/>
@@ -6619,7 +6615,7 @@
       <w:pPr>
         <w:pStyle w:val="5"/>
       </w:pPr>
-      <w:bookmarkStart w:id="9" w:name="_Toc15445"/>
+      <w:bookmarkStart w:id="9" w:name="_Toc24660"/>
       <w:r>
         <w:rPr>
           <w:rFonts w:ascii="宋体" w:hAnsi="宋体" w:eastAsia="宋体"/>
@@ -7490,7 +7486,7 @@
       <w:pPr>
         <w:pStyle w:val="5"/>
       </w:pPr>
-      <w:bookmarkStart w:id="10" w:name="_Toc617"/>
+      <w:bookmarkStart w:id="10" w:name="_Toc18865"/>
       <w:r>
         <w:rPr>
           <w:rFonts w:ascii="宋体" w:hAnsi="宋体" w:eastAsia="宋体"/>
@@ -7905,7 +7901,7 @@
       <w:pPr>
         <w:pStyle w:val="4"/>
       </w:pPr>
-      <w:bookmarkStart w:id="11" w:name="_Toc13765"/>
+      <w:bookmarkStart w:id="11" w:name="_Toc2684"/>
       <w:r>
         <w:rPr>
           <w:rFonts w:ascii="宋体" w:hAnsi="宋体" w:eastAsia="宋体"/>
@@ -7920,7 +7916,7 @@
       <w:pPr>
         <w:pStyle w:val="5"/>
       </w:pPr>
-      <w:bookmarkStart w:id="12" w:name="_Toc9306"/>
+      <w:bookmarkStart w:id="12" w:name="_Toc22889"/>
       <w:r>
         <w:rPr>
           <w:rFonts w:ascii="宋体" w:hAnsi="宋体" w:eastAsia="宋体"/>
@@ -7945,7 +7941,7 @@
       <w:pPr>
         <w:pStyle w:val="5"/>
       </w:pPr>
-      <w:bookmarkStart w:id="13" w:name="_Toc12878"/>
+      <w:bookmarkStart w:id="13" w:name="_Toc24813"/>
       <w:r>
         <w:rPr>
           <w:rFonts w:ascii="宋体" w:hAnsi="宋体" w:eastAsia="宋体"/>
@@ -11228,7 +11224,7 @@
       <w:pPr>
         <w:pStyle w:val="4"/>
       </w:pPr>
-      <w:bookmarkStart w:id="14" w:name="_Toc24645"/>
+      <w:bookmarkStart w:id="14" w:name="_Toc13551"/>
       <w:r>
         <w:rPr>
           <w:rFonts w:ascii="宋体" w:hAnsi="宋体" w:eastAsia="宋体"/>
@@ -12642,7 +12638,7 @@
       <w:pPr>
         <w:pStyle w:val="4"/>
       </w:pPr>
-      <w:bookmarkStart w:id="15" w:name="_Toc24601"/>
+      <w:bookmarkStart w:id="15" w:name="_Toc25324"/>
       <w:r>
         <w:rPr>
           <w:rFonts w:ascii="宋体" w:hAnsi="宋体" w:eastAsia="宋体"/>
@@ -12657,7 +12653,7 @@
       <w:pPr>
         <w:pStyle w:val="5"/>
       </w:pPr>
-      <w:bookmarkStart w:id="16" w:name="_Toc20453"/>
+      <w:bookmarkStart w:id="16" w:name="_Toc24025"/>
       <w:r>
         <w:rPr>
           <w:rFonts w:ascii="宋体" w:hAnsi="宋体" w:eastAsia="宋体"/>
@@ -14452,7 +14448,7 @@
                 <w:b w:val="0"/>
                 <w:sz w:val="17"/>
               </w:rPr>
-              <w:t>2026-10-26—10-29</w:t>
+              <w:t>2026-10-26—10-31</w:t>
             </w:r>
           </w:p>
         </w:tc>
@@ -14492,7 +14488,7 @@
                 <w:b w:val="0"/>
                 <w:sz w:val="17"/>
               </w:rPr>
-              <w:t>代码冻结、全新环境复核、133 条测试复跑、演示彩排、最终提交</w:t>
+              <w:t>代码冻结、全新环境复核、136 条测试复跑、演示彩排、最终提交</w:t>
             </w:r>
           </w:p>
         </w:tc>
@@ -14547,7 +14543,7 @@
       <w:pPr>
         <w:pStyle w:val="5"/>
       </w:pPr>
-      <w:bookmarkStart w:id="17" w:name="_Toc19803"/>
+      <w:bookmarkStart w:id="17" w:name="_Toc5525"/>
       <w:r>
         <w:rPr>
           <w:rFonts w:ascii="宋体" w:hAnsi="宋体" w:eastAsia="宋体"/>
@@ -15084,7 +15080,7 @@
       <w:pPr>
         <w:pStyle w:val="5"/>
       </w:pPr>
-      <w:bookmarkStart w:id="18" w:name="_Toc24153"/>
+      <w:bookmarkStart w:id="18" w:name="_Toc3909"/>
       <w:r>
         <w:rPr>
           <w:rFonts w:ascii="宋体" w:hAnsi="宋体" w:eastAsia="宋体"/>
@@ -15209,7 +15205,7 @@
       <w:pPr>
         <w:pStyle w:val="4"/>
       </w:pPr>
-      <w:bookmarkStart w:id="19" w:name="_Toc32627"/>
+      <w:bookmarkStart w:id="19" w:name="_Toc12344"/>
       <w:r>
         <w:rPr>
           <w:rFonts w:ascii="宋体" w:hAnsi="宋体" w:eastAsia="宋体"/>
@@ -16116,7 +16112,7 @@
                 <w:b w:val="0"/>
                 <w:sz w:val="17"/>
               </w:rPr>
-              <w:t>2026-10-29</w:t>
+              <w:t>2026-10-31</w:t>
             </w:r>
           </w:p>
         </w:tc>
@@ -16179,14 +16175,14 @@
           <w:color w:val="6E7B90"/>
           <w:sz w:val="19"/>
         </w:rPr>
-        <w:t>验收提示：133 条自动化测试全部通过是本计划编制时的项目快照。最终验收应在 2026-10-29 冻结版本上重新执行，以实际通过数、失败数、错误数和日志为准；如果后续代码变化导致结果不同，以重跑结果为准并重新评估是否放行。</w:t>
+        <w:t>验收提示：136 条自动化测试全部通过是本计划编制时的项目快照。最终验收应在 2026-10-31 冻结版本上重新执行，以实际通过数、失败数、错误数和日志为准；如果后续代码变化导致结果不同，以重跑结果为准并重新评估是否放行。</w:t>
       </w:r>
     </w:p>
     <w:p>
       <w:pPr>
         <w:pStyle w:val="4"/>
       </w:pPr>
-      <w:bookmarkStart w:id="20" w:name="_Toc3926"/>
+      <w:bookmarkStart w:id="20" w:name="_Toc4422"/>
       <w:r>
         <w:rPr>
           <w:rFonts w:ascii="宋体" w:hAnsi="宋体" w:eastAsia="宋体"/>
@@ -17523,7 +17519,7 @@
       <w:pPr>
         <w:pStyle w:val="4"/>
       </w:pPr>
-      <w:bookmarkStart w:id="21" w:name="_Toc30667"/>
+      <w:bookmarkStart w:id="21" w:name="_Toc6294"/>
       <w:r>
         <w:rPr>
           <w:rFonts w:ascii="宋体" w:hAnsi="宋体" w:eastAsia="宋体"/>
@@ -17538,7 +17534,7 @@
       <w:pPr>
         <w:pStyle w:val="5"/>
       </w:pPr>
-      <w:bookmarkStart w:id="22" w:name="_Toc24835"/>
+      <w:bookmarkStart w:id="22" w:name="_Toc24749"/>
       <w:r>
         <w:rPr>
           <w:rFonts w:ascii="宋体" w:hAnsi="宋体" w:eastAsia="宋体"/>
@@ -18326,7 +18322,7 @@
       <w:pPr>
         <w:pStyle w:val="5"/>
       </w:pPr>
-      <w:bookmarkStart w:id="23" w:name="_Toc15561"/>
+      <w:bookmarkStart w:id="23" w:name="_Toc5636"/>
       <w:r>
         <w:rPr>
           <w:rFonts w:ascii="宋体" w:hAnsi="宋体" w:eastAsia="宋体"/>
@@ -18619,7 +18615,7 @@
       <w:pPr>
         <w:pStyle w:val="5"/>
       </w:pPr>
-      <w:bookmarkStart w:id="24" w:name="_Toc9629"/>
+      <w:bookmarkStart w:id="24" w:name="_Toc5654"/>
       <w:r>
         <w:rPr>
           <w:rFonts w:ascii="宋体" w:hAnsi="宋体" w:eastAsia="宋体"/>
@@ -19044,7 +19040,7 @@
       <w:pPr>
         <w:pStyle w:val="5"/>
       </w:pPr>
-      <w:bookmarkStart w:id="25" w:name="_Toc28509"/>
+      <w:bookmarkStart w:id="25" w:name="_Toc6858"/>
       <w:r>
         <w:rPr>
           <w:rFonts w:ascii="宋体" w:hAnsi="宋体" w:eastAsia="宋体"/>
@@ -19135,7 +19131,7 @@
       <w:pPr>
         <w:pStyle w:val="5"/>
       </w:pPr>
-      <w:bookmarkStart w:id="26" w:name="_Toc23381"/>
+      <w:bookmarkStart w:id="26" w:name="_Toc3684"/>
       <w:r>
         <w:rPr>
           <w:rFonts w:ascii="宋体" w:hAnsi="宋体" w:eastAsia="宋体"/>
@@ -19206,7 +19202,7 @@
       <w:pPr>
         <w:pStyle w:val="4"/>
       </w:pPr>
-      <w:bookmarkStart w:id="27" w:name="_Toc31216"/>
+      <w:bookmarkStart w:id="27" w:name="_Toc15657"/>
       <w:r>
         <w:rPr>
           <w:rFonts w:ascii="宋体" w:hAnsi="宋体" w:eastAsia="宋体"/>
@@ -19221,7 +19217,7 @@
       <w:pPr>
         <w:pStyle w:val="5"/>
       </w:pPr>
-      <w:bookmarkStart w:id="28" w:name="_Toc31753"/>
+      <w:bookmarkStart w:id="28" w:name="_Toc10254"/>
       <w:r>
         <w:rPr>
           <w:rFonts w:ascii="宋体" w:hAnsi="宋体" w:eastAsia="宋体"/>
@@ -19560,7 +19556,7 @@
                 <w:b w:val="0"/>
                 <w:sz w:val="17"/>
               </w:rPr>
-              <w:t>pytest 共 133 条，编制时全部通过；冻结版本验收时以实际输出为准</w:t>
+              <w:t>pytest 共 136 条，编制时全部通过；冻结版本验收时以实际输出为准</w:t>
             </w:r>
           </w:p>
         </w:tc>
@@ -19819,7 +19815,7 @@
       <w:pPr>
         <w:pStyle w:val="5"/>
       </w:pPr>
-      <w:bookmarkStart w:id="29" w:name="_Toc2996"/>
+      <w:bookmarkStart w:id="29" w:name="_Toc1525"/>
       <w:r>
         <w:rPr>
           <w:rFonts w:ascii="宋体" w:hAnsi="宋体" w:eastAsia="宋体"/>
@@ -20781,7 +20777,7 @@
       <w:pPr>
         <w:pStyle w:val="5"/>
       </w:pPr>
-      <w:bookmarkStart w:id="30" w:name="_Toc19390"/>
+      <w:bookmarkStart w:id="30" w:name="_Toc17390"/>
       <w:r>
         <w:rPr>
           <w:rFonts w:ascii="宋体" w:hAnsi="宋体" w:eastAsia="宋体"/>
@@ -21399,7 +21395,7 @@
       <w:pPr>
         <w:pStyle w:val="5"/>
       </w:pPr>
-      <w:bookmarkStart w:id="31" w:name="_Toc27569"/>
+      <w:bookmarkStart w:id="31" w:name="_Toc10409"/>
       <w:r>
         <w:rPr>
           <w:rFonts w:ascii="宋体" w:hAnsi="宋体" w:eastAsia="宋体"/>
@@ -21522,7 +21518,7 @@
       <w:pPr>
         <w:pStyle w:val="5"/>
       </w:pPr>
-      <w:bookmarkStart w:id="32" w:name="_Toc9231"/>
+      <w:bookmarkStart w:id="32" w:name="_Toc28018"/>
       <w:r>
         <w:rPr>
           <w:rFonts w:ascii="宋体" w:hAnsi="宋体" w:eastAsia="宋体"/>
@@ -21978,7 +21974,7 @@
       <w:pPr>
         <w:pStyle w:val="4"/>
       </w:pPr>
-      <w:bookmarkStart w:id="33" w:name="_Toc18693"/>
+      <w:bookmarkStart w:id="33" w:name="_Toc6487"/>
       <w:r>
         <w:rPr>
           <w:rFonts w:ascii="宋体" w:hAnsi="宋体" w:eastAsia="宋体"/>
@@ -21993,7 +21989,7 @@
       <w:pPr>
         <w:pStyle w:val="5"/>
       </w:pPr>
-      <w:bookmarkStart w:id="34" w:name="_Toc27623"/>
+      <w:bookmarkStart w:id="34" w:name="_Toc27994"/>
       <w:r>
         <w:rPr>
           <w:rFonts w:ascii="宋体" w:hAnsi="宋体" w:eastAsia="宋体"/>
@@ -22042,12 +22038,6 @@
             <w:insideH w:val="single" w:color="auto" w:sz="4" w:space="0"/>
             <w:insideV w:val="single" w:color="auto" w:sz="4" w:space="0"/>
           </w:tblBorders>
-          <w:tblCellMar>
-            <w:top w:w="0" w:type="dxa"/>
-            <w:left w:w="108" w:type="dxa"/>
-            <w:bottom w:w="0" w:type="dxa"/>
-            <w:right w:w="108" w:type="dxa"/>
-          </w:tblCellMar>
         </w:tblPrEx>
         <w:trPr>
           <w:tblHeader/>
@@ -22774,7 +22764,7 @@
       <w:pPr>
         <w:pStyle w:val="5"/>
       </w:pPr>
-      <w:bookmarkStart w:id="35" w:name="_Toc6688"/>
+      <w:bookmarkStart w:id="35" w:name="_Toc22248"/>
       <w:r>
         <w:rPr>
           <w:rFonts w:ascii="宋体" w:hAnsi="宋体" w:eastAsia="宋体"/>
@@ -22859,7 +22849,7 @@
       <w:pPr>
         <w:pStyle w:val="4"/>
       </w:pPr>
-      <w:bookmarkStart w:id="36" w:name="_Toc9799"/>
+      <w:bookmarkStart w:id="36" w:name="_Toc25453"/>
       <w:r>
         <w:rPr>
           <w:rFonts w:ascii="宋体" w:hAnsi="宋体" w:eastAsia="宋体"/>
@@ -25027,7 +25017,7 @@
       <w:pPr>
         <w:pStyle w:val="5"/>
       </w:pPr>
-      <w:bookmarkStart w:id="37" w:name="_Toc27411"/>
+      <w:bookmarkStart w:id="37" w:name="_Toc13442"/>
       <w:r>
         <w:rPr>
           <w:rFonts w:ascii="宋体" w:hAnsi="宋体" w:eastAsia="宋体"/>
@@ -25052,7 +25042,7 @@
       <w:pPr>
         <w:pStyle w:val="4"/>
       </w:pPr>
-      <w:bookmarkStart w:id="38" w:name="_Toc6108"/>
+      <w:bookmarkStart w:id="38" w:name="_Toc9927"/>
       <w:r>
         <w:rPr>
           <w:rFonts w:ascii="宋体" w:hAnsi="宋体" w:eastAsia="宋体"/>
@@ -25067,7 +25057,7 @@
       <w:pPr>
         <w:pStyle w:val="5"/>
       </w:pPr>
-      <w:bookmarkStart w:id="39" w:name="_Toc15145"/>
+      <w:bookmarkStart w:id="39" w:name="_Toc793"/>
       <w:r>
         <w:rPr>
           <w:rFonts w:ascii="宋体" w:hAnsi="宋体" w:eastAsia="宋体"/>
@@ -26075,7 +26065,7 @@
                 <w:b w:val="0"/>
                 <w:sz w:val="17"/>
               </w:rPr>
-              <w:t>冻结版本执行 pytest，133 条用例的最终实际结果全部通过；若有变化以实际日志为准</w:t>
+              <w:t>冻结版本执行 pytest，136 条用例的最终实际结果全部通过；若有变化以实际日志为准</w:t>
             </w:r>
           </w:p>
         </w:tc>
@@ -26171,7 +26161,7 @@
       <w:pPr>
         <w:pStyle w:val="5"/>
       </w:pPr>
-      <w:bookmarkStart w:id="40" w:name="_Toc17079"/>
+      <w:bookmarkStart w:id="40" w:name="_Toc27058"/>
       <w:r>
         <w:rPr>
           <w:rFonts w:ascii="宋体" w:hAnsi="宋体" w:eastAsia="宋体"/>
@@ -26284,7 +26274,7 @@
       <w:pPr>
         <w:pStyle w:val="5"/>
       </w:pPr>
-      <w:bookmarkStart w:id="41" w:name="_Toc19549"/>
+      <w:bookmarkStart w:id="41" w:name="_Toc17514"/>
       <w:r>
         <w:rPr>
           <w:rFonts w:ascii="宋体" w:hAnsi="宋体" w:eastAsia="宋体"/>
@@ -26983,7 +26973,7 @@
       <w:pPr>
         <w:pStyle w:val="5"/>
       </w:pPr>
-      <w:bookmarkStart w:id="42" w:name="_Toc12396"/>
+      <w:bookmarkStart w:id="42" w:name="_Toc17703"/>
       <w:r>
         <w:rPr>
           <w:rFonts w:ascii="宋体" w:hAnsi="宋体" w:eastAsia="宋体"/>
@@ -27040,7 +27030,7 @@
       <w:pPr>
         <w:pStyle w:val="4"/>
       </w:pPr>
-      <w:bookmarkStart w:id="43" w:name="_Toc7020"/>
+      <w:bookmarkStart w:id="43" w:name="_Toc6902"/>
       <w:r>
         <w:rPr>
           <w:rFonts w:ascii="宋体" w:hAnsi="宋体" w:eastAsia="宋体"/>
@@ -27058,7 +27048,7 @@
           <w:b w:val="0"/>
           <w:sz w:val="21"/>
         </w:rPr>
-        <w:t>本计划以 2026-10-29 为交付控制点，以 12 周为整体窗口，以八个业务与管理模块、133 条自动化测试、10 张 UML 和前端页面截图为课程交付基线。项目最终是否通过，不取决于计划中写了多少功能，而取决于冻结版本能否按验收表复现、测试结果是否真实、文档是否与实现一致、权限边界是否可靠。</w:t>
+        <w:t>本计划以 2026-10-31 为交付控制点，以 12 周为整体窗口，以八个业务与管理模块、136 条自动化测试、10 张 UML 和前端页面截图为课程交付基线。项目最终是否通过，不取决于计划中写了多少功能，而取决于冻结版本能否按验收表复现、测试结果是否真实、文档是否与实现一致、权限边界是否可靠。</w:t>
       </w:r>
     </w:p>
     <w:p>
@@ -27557,7 +27547,7 @@
     <w:lsdException w:unhideWhenUsed="0" w:uiPriority="73" w:semiHidden="0" w:name="Colorful Grid Accent 1"/>
     <w:lsdException w:unhideWhenUsed="0" w:uiPriority="60" w:semiHidden="0" w:name="Light Shading Accent 2"/>
     <w:lsdException w:unhideWhenUsed="0" w:uiPriority="61" w:semiHidden="0" w:name="Light List Accent 2"/>
-    <w:lsdException w:unhideWhenUsed="0" w:uiPriority="62" w:semiHidden="0" w:name="Light Grid Accent 2"/>
+    <w:lsdException w:qFormat="1" w:unhideWhenUsed="0" w:uiPriority="62" w:semiHidden="0" w:name="Light Grid Accent 2"/>
     <w:lsdException w:unhideWhenUsed="0" w:uiPriority="63" w:semiHidden="0" w:name="Medium Shading 1 Accent 2"/>
     <w:lsdException w:unhideWhenUsed="0" w:uiPriority="64" w:semiHidden="0" w:name="Medium Shading 2 Accent 2"/>
     <w:lsdException w:unhideWhenUsed="0" w:uiPriority="65" w:semiHidden="0" w:name="Medium List 1 Accent 2"/>
@@ -29831,6 +29821,7 @@
   <w:style w:type="table" w:styleId="52">
     <w:name w:val="Light Grid Accent 2"/>
     <w:basedOn w:val="34"/>
+    <w:qFormat/>
     <w:uiPriority w:val="62"/>
     <w:pPr>
       <w:spacing w:after="0" w:line="240" w:lineRule="auto"/>
@@ -39660,13 +39651,13 @@
     <w:name w:val="Header Char"/>
     <w:basedOn w:val="134"/>
     <w:link w:val="26"/>
+    <w:qFormat/>
     <w:uiPriority w:val="99"/>
   </w:style>
   <w:style w:type="character" w:customStyle="1" w:styleId="138">
     <w:name w:val="Footer Char"/>
     <w:basedOn w:val="134"/>
     <w:link w:val="25"/>
-    <w:qFormat/>
     <w:uiPriority w:val="99"/>
   </w:style>
   <w:style w:type="paragraph" w:styleId="139">

</xml_diff>